<commit_message>
Sync site with latest resume wording
</commit_message>
<xml_diff>
--- a/resume-ai-product-manager.docx
+++ b/resume-ai-product-manager.docx
@@ -670,7 +670,7 @@
           <w:sz w:val="17"/>
           <w:szCs w:val="17"/>
         </w:rPr>
-        <w:t xml:space="preserve"> 具备从产品定义到技术落地的独立判断能力；主导 Multi-Agent 工作流设计、RAG 三层检索架构、对话状态机与 Prompt Engineering 落地；自主完成 LLM 选型评测与 Embedding 模型调优，RAG 召回准确率达 92%，数字人专业讲解准确率达 95%。</w:t>
+        <w:t xml:space="preserve"> 具备从产品定义到技术落地的独立判断能力；主导 AI 创作工作流、RAG 三层检索架构、对话状态机与 Prompt Engineering 的产品设计与落地；自主完成 LLM / Embedding 模型选型评测与检索效果调优，RAG 召回准确率达 92%，RAG 销售系统专业讲解准确率达 95%。</w:t>
       </w:r>
     </w:p>
     <w:p>
@@ -1073,7 +1073,26 @@
           <w:sz w:val="22"/>
           <w:szCs w:val="22"/>
         </w:rPr>
-        <w:t>| 产品经理</w:t>
+        <w:t xml:space="preserve">| </w:t>
+      </w:r>
+      <w:r>
+        <w:rPr>
+          <w:rFonts w:hint="eastAsia" w:ascii="MiSans Heavy" w:hAnsi="MiSans Heavy" w:eastAsia="MiSans Heavy" w:cs="MiSans Heavy"/>
+          <w:b/>
+          <w:sz w:val="22"/>
+          <w:szCs w:val="22"/>
+          <w:lang w:val="en-US" w:eastAsia="zh-CN"/>
+        </w:rPr>
+        <w:t>AI</w:t>
+      </w:r>
+      <w:r>
+        <w:rPr>
+          <w:rFonts w:hint="eastAsia" w:ascii="MiSans Heavy" w:hAnsi="MiSans Heavy" w:eastAsia="MiSans Heavy" w:cs="MiSans Heavy"/>
+          <w:b/>
+          <w:sz w:val="22"/>
+          <w:szCs w:val="22"/>
+        </w:rPr>
+        <w:t>产品经理</w:t>
       </w:r>
       <w:r>
         <w:rPr>
@@ -1341,7 +1360,7 @@
           <w:szCs w:val="16"/>
           <w:lang w:val="en-US" w:eastAsia="zh-CN"/>
         </w:rPr>
-        <w:t>● 多Agent全链路视觉工作流设计：</w:t>
+        <w:t>● AI 全链路视觉工作流设计：</w:t>
       </w:r>
       <w:r>
         <w:rPr>
@@ -1618,7 +1637,7 @@
           <w:szCs w:val="15"/>
           <w:lang w:val="en-US" w:eastAsia="zh-CN"/>
         </w:rPr>
-        <w:t>负责“订阅 + 积分”的商业化方案设计，将积分消耗与模型调用成本挂钩，支持用户按质量档和速度档选择生成能力；参与 PMF 验证和早期付费转化方案讨论，平台完成 8 家付费影视工作室签约，目标毛利率 40% 以上。</w:t>
+        <w:t>负责“订阅 + 积分”的商业化方案设计，将积分消耗与模型调用成本挂钩，支持用户按质量档和速度档选择生成能力；参与 PMF 验证和早期付费转化方案讨论，平台完成 8 家早期付费/试点影视工作室签约，验证外部工作室付费意愿；模型调用层目标毛利率约 40%</w:t>
       </w:r>
     </w:p>
     <w:p>
@@ -1644,7 +1663,7 @@
         <w:jc w:val="both"/>
         <w:textAlignment w:val="auto"/>
         <w:rPr>
-          <w:rFonts w:hint="eastAsia" w:ascii="MiSans Light" w:hAnsi="MiSans Light" w:eastAsia="MiSans Light" w:cs="MiSans Light"/>
+          <w:rFonts w:hint="default" w:ascii="MiSans Light" w:hAnsi="MiSans Light" w:eastAsia="MiSans Light" w:cs="MiSans Light"/>
           <w:sz w:val="15"/>
           <w:szCs w:val="15"/>
           <w:lang w:val="en-US" w:eastAsia="zh-CN"/>
@@ -1677,7 +1696,7 @@
           <w:szCs w:val="15"/>
           <w:lang w:val="en-US" w:eastAsia="zh-CN"/>
         </w:rPr>
-        <w:t>完成从0到1可用产品交付；分镜策划效率提升约3倍，内容生产周期缩短约50%；RAG召回准确率92%（口语化指令召回从60%提升至92%）；批注AI建议一键采纳率78%；辅助增量作品斩获B站AI动画大赛二等奖1项、三等奖2项；1部作品入围第七届海南岛国际电影节AI电影季、第十六届北京国际电影节AIGC电影单元；另有作品获海螺AI × WAIFF（世界人工智能电影节）最佳叙事奖。完成商业化冷启动，签约8家付费影视工作室；采用「订阅+积分」双轨变现模式，积分消耗与模型调用成本直接挂钩，平台目标毛利率40%以上。</w:t>
+        <w:t>完成从0到1可用产品交付；分镜策划效率提升约3倍，内容生产周期缩短约50%；RAG召回准确率92%（口语化指令召回从60%提升至92%）；批注AI建议一键采纳率78%；辅助增量作品斩获B站AI动画大赛二等奖1项、三等奖2项；1部作品入围第七届海南岛国际电影节AI电影季、第十六届北京国际电影节AIGC电影单元；另有作品获海螺AI × WAIFF（世界人工智能电影节）最佳叙事奖。完成商业化冷启动，签约 8 家早期付费/试点影视工作室，验证外部工作室付费意愿；采用「订阅+积分」双轨变现模式，积分消耗与模型调用成本直接挂钩，模型调用层目标毛利率约 40%，通过积分制将生成消耗与模型 API 成本挂钩。</w:t>
       </w:r>
     </w:p>
     <w:p>
@@ -1748,7 +1767,7 @@
           <w:szCs w:val="20"/>
           <w:lang w:val="en-US" w:eastAsia="zh-CN"/>
         </w:rPr>
-        <w:t>项目二：AI影视承接平台</w:t>
+        <w:t>项目二：AI 影视供需匹配平台</w:t>
       </w:r>
       <w:r>
         <w:rPr>
@@ -1884,7 +1903,7 @@
           <w:szCs w:val="16"/>
           <w:lang w:val="en-US" w:eastAsia="zh-CN"/>
         </w:rPr>
-        <w:t>● 2周内独立交付双角色完整产品：</w:t>
+        <w:t>●  AI 需求理解与结构化设计：</w:t>
       </w:r>
       <w:r>
         <w:rPr>
@@ -1894,7 +1913,7 @@
           <w:szCs w:val="15"/>
           <w:lang w:val="en-US" w:eastAsia="zh-CN"/>
         </w:rPr>
-        <w:t xml:space="preserve"> 覆盖项目发布、创作者广场、合同签署、里程碑交付审核全链路，内测后持续迭代</w:t>
+        <w:t xml:space="preserve"> 设计需求发布流程中的 AI 辅助填写能力，将甲方的口语化创作想法转化为项目背景、视觉风格、用途场景、交付要求等结构化描述，降低非专业甲方发布需求的表达门槛，并提升后续匹配质量。</w:t>
       </w:r>
     </w:p>
     <w:p>
@@ -1937,7 +1956,7 @@
           <w:szCs w:val="16"/>
           <w:lang w:val="en-US" w:eastAsia="zh-CN"/>
         </w:rPr>
-        <w:t>● 基于内测反馈优化创作者匹配体验：</w:t>
+        <w:t>● 创作者能力标签体系设计：</w:t>
       </w:r>
       <w:r>
         <w:rPr>
@@ -1947,7 +1966,7 @@
           <w:szCs w:val="15"/>
           <w:lang w:val="en-US" w:eastAsia="zh-CN"/>
         </w:rPr>
-        <w:t xml:space="preserve"> 引入AI自动打标签机制，依据创作者上传作品生成能力标签，甲方发布需求后系统自动匹配相关创作者，点击卡片可直接查看匹配作品，显著降低甲方筛选成本。</w:t>
+        <w:t xml:space="preserve"> 围绕作品风格、擅长题材、使用工具、交付类型、过往案例等维度设计创作者能力标签；结合创作者上传作品与个人简介生成能力画像，为匹配算法提供可计算的特征基础。</w:t>
       </w:r>
     </w:p>
     <w:p>
@@ -1990,27 +2009,17 @@
           <w:szCs w:val="16"/>
           <w:lang w:val="en-US" w:eastAsia="zh-CN"/>
         </w:rPr>
-        <w:t>● 设计灵活托管付款机制：</w:t>
-      </w:r>
-      <w:r>
-        <w:rPr>
-          <w:rFonts w:hint="eastAsia" w:ascii="MiSans" w:hAnsi="MiSans" w:eastAsia="MiSans" w:cs="MiSans"/>
+        <w:t>● AI 智能匹配与决策面板：</w:t>
+      </w:r>
+      <w:r>
+        <w:rPr>
+          <w:rFonts w:hint="eastAsia" w:ascii="MiSans Light" w:hAnsi="MiSans Light" w:eastAsia="MiSans Light" w:cs="MiSans Light"/>
           <w:color w:val="auto"/>
           <w:sz w:val="15"/>
           <w:szCs w:val="15"/>
           <w:lang w:val="en-US" w:eastAsia="zh-CN"/>
         </w:rPr>
-        <w:t xml:space="preserve"> </w:t>
-      </w:r>
-      <w:r>
-        <w:rPr>
-          <w:rFonts w:hint="eastAsia" w:ascii="MiSans Light" w:hAnsi="MiSans Light" w:eastAsia="MiSans Light" w:cs="MiSans Light"/>
-          <w:color w:val="auto"/>
-          <w:sz w:val="15"/>
-          <w:szCs w:val="15"/>
-          <w:lang w:val="en-US" w:eastAsia="zh-CN"/>
-        </w:rPr>
-        <w:t>支持甲乙双方自定义付款比例与里程碑节点，资金由平台托管、按节点释放。</w:t>
+        <w:t>设计创作者匹配评分机制，基于项目需求、品类、风格标签、工具能力与作品相关性生成匹配分，并在甲方侧展示推荐理由、匹配作品与创作者能力摘要，帮助甲方从“人工浏览筛选”转为“AI 推荐 + 人工决策”。</w:t>
       </w:r>
     </w:p>
     <w:p>
@@ -2043,94 +2052,27 @@
           <w:lang w:val="en-US" w:eastAsia="zh-CN"/>
         </w:rPr>
       </w:pPr>
-    </w:p>
-    <w:p>
-      <w:pPr>
-        <w:tabs>
-          <w:tab w:val="left" w:pos="9084"/>
-          <w:tab w:val="left" w:pos="9479"/>
-        </w:tabs>
-        <w:spacing w:before="24" w:beforeLines="10" w:after="24" w:afterLines="10" w:line="280" w:lineRule="exact"/>
-        <w:ind w:left="130"/>
-        <w:jc w:val="both"/>
-        <w:rPr>
-          <w:rFonts w:hint="eastAsia" w:ascii="MiSans" w:hAnsi="MiSans" w:eastAsia="MiSans" w:cs="MiSans"/>
-          <w:b/>
-          <w:sz w:val="20"/>
-          <w:szCs w:val="20"/>
-          <w:lang w:val="en-US" w:eastAsia="zh-CN"/>
-        </w:rPr>
-      </w:pPr>
-      <w:r>
-        <w:rPr>
-          <w:rFonts w:hint="eastAsia" w:ascii="MiSans" w:hAnsi="MiSans" w:eastAsia="MiSans" w:cs="MiSans"/>
-          <w:b/>
-          <w:sz w:val="22"/>
-          <w:szCs w:val="22"/>
-          <w:lang w:val="en-US" w:eastAsia="zh-CN"/>
-        </w:rPr>
-        <w:t xml:space="preserve">深圳华禧文化 | 产品经理 </w:t>
-      </w:r>
-      <w:r>
-        <w:rPr>
-          <w:rFonts w:hint="eastAsia" w:ascii="MiSans" w:hAnsi="MiSans" w:eastAsia="MiSans" w:cs="MiSans"/>
-          <w:b w:val="0"/>
+      <w:r>
+        <w:rPr>
+          <w:rFonts w:hint="eastAsia" w:ascii="MiSans" w:hAnsi="MiSans" w:eastAsia="MiSans" w:cs="MiSans"/>
+          <w:b/>
           <w:bCs/>
-          <w:color w:val="404040" w:themeColor="text1" w:themeTint="BF"/>
-          <w:sz w:val="20"/>
-          <w:szCs w:val="20"/>
-          <w:lang w:val="en-US" w:eastAsia="zh-CN"/>
-          <w14:textFill>
-            <w14:solidFill>
-              <w14:schemeClr w14:val="tx1">
-                <w14:lumMod w14:val="75000"/>
-                <w14:lumOff w14:val="25000"/>
-              </w14:schemeClr>
-            </w14:solidFill>
-          </w14:textFill>
-        </w:rPr>
-        <w:t xml:space="preserve"> </w:t>
-      </w:r>
-      <w:r>
-        <w:rPr>
-          <w:rFonts w:hint="eastAsia" w:ascii="MiSans" w:hAnsi="MiSans" w:eastAsia="MiSans" w:cs="MiSans"/>
-          <w:b/>
-          <w:bCs w:val="0"/>
-          <w:color w:val="404040" w:themeColor="text1" w:themeTint="BF"/>
+          <w:color w:val="auto"/>
           <w:sz w:val="16"/>
           <w:szCs w:val="16"/>
           <w:lang w:val="en-US" w:eastAsia="zh-CN"/>
-          <w14:textFill>
-            <w14:solidFill>
-              <w14:schemeClr w14:val="tx1">
-                <w14:lumMod w14:val="75000"/>
-                <w14:lumOff w14:val="25000"/>
-              </w14:schemeClr>
-            </w14:solidFill>
-          </w14:textFill>
-        </w:rPr>
-        <w:t xml:space="preserve">(黄金 ToB 批发企业，内部推进数字化与 AI 赋能) </w:t>
-      </w:r>
-      <w:r>
-        <w:rPr>
-          <w:rFonts w:hint="eastAsia" w:ascii="MiSans" w:hAnsi="MiSans" w:eastAsia="MiSans" w:cs="MiSans"/>
-          <w:b/>
-          <w:bCs w:val="0"/>
-          <w:sz w:val="17"/>
-          <w:szCs w:val="17"/>
-          <w:lang w:val="en-US" w:eastAsia="zh-CN"/>
-        </w:rPr>
-        <w:t xml:space="preserve">                                                 </w:t>
-      </w:r>
-      <w:r>
-        <w:rPr>
-          <w:rFonts w:hint="eastAsia" w:ascii="MiSans" w:hAnsi="MiSans" w:eastAsia="MiSans" w:cs="MiSans"/>
-          <w:b/>
-          <w:sz w:val="22"/>
-          <w:szCs w:val="22"/>
-          <w:lang w:val="en-US" w:eastAsia="zh-CN"/>
-        </w:rPr>
-        <w:t>2024.07-2025.09</w:t>
+        </w:rPr>
+        <w:t>● 双角色交易闭环设计：</w:t>
+      </w:r>
+      <w:r>
+        <w:rPr>
+          <w:rFonts w:hint="eastAsia" w:ascii="MiSans Light" w:hAnsi="MiSans Light" w:eastAsia="MiSans Light" w:cs="MiSans Light"/>
+          <w:color w:val="auto"/>
+          <w:sz w:val="15"/>
+          <w:szCs w:val="15"/>
+          <w:lang w:val="en-US" w:eastAsia="zh-CN"/>
+        </w:rPr>
+        <w:t>2 周内独立完成需求方与创作者双角色 MVP，覆盖需求发布、应征投标、作品集查看、甲方筛选、合同/托管付款、里程碑交付审核等流程，支撑内测用户完成完整供需匹配闭环。</w:t>
       </w:r>
     </w:p>
     <w:p>
@@ -2156,7 +2098,26 @@
         <w:jc w:val="both"/>
         <w:textAlignment w:val="auto"/>
         <w:rPr>
-          <w:rFonts w:hint="eastAsia" w:ascii="MiSans Heavy" w:hAnsi="MiSans Heavy" w:eastAsia="MiSans Heavy" w:cs="MiSans Heavy"/>
+          <w:rFonts w:hint="eastAsia" w:ascii="MiSans Light" w:hAnsi="MiSans Light" w:eastAsia="MiSans Light" w:cs="MiSans Light"/>
+          <w:color w:val="auto"/>
+          <w:sz w:val="15"/>
+          <w:szCs w:val="15"/>
+          <w:lang w:val="en-US" w:eastAsia="zh-CN"/>
+        </w:rPr>
+      </w:pPr>
+    </w:p>
+    <w:p>
+      <w:pPr>
+        <w:tabs>
+          <w:tab w:val="left" w:pos="9084"/>
+          <w:tab w:val="left" w:pos="9479"/>
+        </w:tabs>
+        <w:spacing w:before="24" w:beforeLines="10" w:after="24" w:afterLines="10" w:line="280" w:lineRule="exact"/>
+        <w:ind w:left="130"/>
+        <w:jc w:val="both"/>
+        <w:rPr>
+          <w:rFonts w:hint="eastAsia" w:ascii="MiSans" w:hAnsi="MiSans" w:eastAsia="MiSans" w:cs="MiSans"/>
+          <w:b/>
           <w:sz w:val="20"/>
           <w:szCs w:val="20"/>
           <w:lang w:val="en-US" w:eastAsia="zh-CN"/>
@@ -2164,14 +2125,74 @@
       </w:pPr>
       <w:r>
         <w:rPr>
-          <w:rFonts w:hint="eastAsia" w:ascii="MiSans Heavy" w:hAnsi="MiSans Heavy" w:eastAsia="MiSans Heavy" w:cs="MiSans Heavy"/>
-          <w:b/>
+          <w:rFonts w:hint="eastAsia" w:ascii="MiSans" w:hAnsi="MiSans" w:eastAsia="MiSans" w:cs="MiSans"/>
+          <w:b/>
+          <w:sz w:val="22"/>
+          <w:szCs w:val="22"/>
+          <w:lang w:val="en-US" w:eastAsia="zh-CN"/>
+        </w:rPr>
+        <w:t xml:space="preserve">深圳华禧文化 | AI产品经理 </w:t>
+      </w:r>
+      <w:r>
+        <w:rPr>
+          <w:rFonts w:hint="eastAsia" w:ascii="MiSans" w:hAnsi="MiSans" w:eastAsia="MiSans" w:cs="MiSans"/>
+          <w:b w:val="0"/>
           <w:bCs/>
+          <w:color w:val="404040" w:themeColor="text1" w:themeTint="BF"/>
           <w:sz w:val="20"/>
           <w:szCs w:val="20"/>
           <w:lang w:val="en-US" w:eastAsia="zh-CN"/>
-        </w:rPr>
-        <w:t>项目一：基于 RAG 的智能客服与销售培训系统</w:t>
+          <w14:textFill>
+            <w14:solidFill>
+              <w14:schemeClr w14:val="tx1">
+                <w14:lumMod w14:val="75000"/>
+                <w14:lumOff w14:val="25000"/>
+              </w14:schemeClr>
+            </w14:solidFill>
+          </w14:textFill>
+        </w:rPr>
+        <w:t xml:space="preserve"> </w:t>
+      </w:r>
+      <w:r>
+        <w:rPr>
+          <w:rFonts w:hint="eastAsia" w:ascii="MiSans" w:hAnsi="MiSans" w:eastAsia="MiSans" w:cs="MiSans"/>
+          <w:b/>
+          <w:bCs w:val="0"/>
+          <w:color w:val="404040" w:themeColor="text1" w:themeTint="BF"/>
+          <w:sz w:val="16"/>
+          <w:szCs w:val="16"/>
+          <w:lang w:val="en-US" w:eastAsia="zh-CN"/>
+          <w14:textFill>
+            <w14:solidFill>
+              <w14:schemeClr w14:val="tx1">
+                <w14:lumMod w14:val="75000"/>
+                <w14:lumOff w14:val="25000"/>
+              </w14:schemeClr>
+            </w14:solidFill>
+          </w14:textFill>
+        </w:rPr>
+        <w:t xml:space="preserve">(黄金 ToB 批发企业，内部推进数字化与 AI 赋能) </w:t>
+      </w:r>
+      <w:r>
+        <w:rPr>
+          <w:rFonts w:hint="eastAsia" w:ascii="MiSans" w:hAnsi="MiSans" w:eastAsia="MiSans" w:cs="MiSans"/>
+          <w:b/>
+          <w:bCs w:val="0"/>
+          <w:sz w:val="17"/>
+          <w:szCs w:val="17"/>
+          <w:lang w:val="en-US" w:eastAsia="zh-CN"/>
+        </w:rPr>
+        <w:t xml:space="preserve">                                                 </w:t>
+      </w:r>
+      <w:r>
+        <w:rPr>
+          <w:rFonts w:hint="eastAsia" w:ascii="MiSans" w:hAnsi="MiSans" w:eastAsia="MiSans" w:cs="MiSans"/>
+          <w:b/>
+          <w:sz w:val="22"/>
+          <w:szCs w:val="22"/>
+          <w:lang w:val="en-US" w:eastAsia="zh-CN"/>
+        </w:rPr>
+        <w:t>2024.07-2025.09</w:t>
       </w:r>
     </w:p>
     <w:p>
@@ -2197,33 +2218,35 @@
         <w:jc w:val="both"/>
         <w:textAlignment w:val="auto"/>
         <w:rPr>
-          <w:rFonts w:hint="eastAsia" w:ascii="MiSans" w:hAnsi="MiSans" w:eastAsia="MiSans" w:cs="MiSans"/>
+          <w:rFonts w:hint="eastAsia" w:ascii="MiSans Heavy" w:hAnsi="MiSans Heavy" w:eastAsia="MiSans Heavy" w:cs="MiSans Heavy"/>
+          <w:sz w:val="20"/>
+          <w:szCs w:val="20"/>
+          <w:lang w:val="en-US" w:eastAsia="zh-CN"/>
+        </w:rPr>
+      </w:pPr>
+      <w:r>
+        <w:rPr>
+          <w:rFonts w:hint="eastAsia" w:ascii="MiSans Heavy" w:hAnsi="MiSans Heavy" w:eastAsia="MiSans Heavy" w:cs="MiSans Heavy"/>
           <w:b/>
           <w:bCs/>
-          <w:sz w:val="17"/>
-          <w:szCs w:val="17"/>
-          <w:lang w:val="en-US" w:eastAsia="zh-CN"/>
-        </w:rPr>
-      </w:pPr>
+          <w:sz w:val="20"/>
+          <w:szCs w:val="20"/>
+          <w:lang w:val="en-US" w:eastAsia="zh-CN"/>
+        </w:rPr>
+        <w:t>项目一：</w:t>
+      </w:r>
+      <w:bookmarkStart w:id="0" w:name="_GoBack"/>
+      <w:bookmarkEnd w:id="0"/>
       <w:r>
         <w:rPr>
           <w:rFonts w:hint="eastAsia" w:ascii="MiSans Heavy" w:hAnsi="MiSans Heavy" w:eastAsia="MiSans Heavy" w:cs="MiSans Heavy"/>
           <w:b/>
           <w:bCs/>
-          <w:sz w:val="17"/>
-          <w:szCs w:val="17"/>
-          <w:lang w:val="en-US" w:eastAsia="zh-CN"/>
-        </w:rPr>
-        <w:t>• 背景与洞察：</w:t>
-      </w:r>
-      <w:r>
-        <w:rPr>
-          <w:rFonts w:hint="eastAsia" w:ascii="MiSans Light" w:hAnsi="MiSans Light" w:eastAsia="MiSans Light" w:cs="MiSans Light"/>
-          <w:sz w:val="17"/>
-          <w:szCs w:val="17"/>
-          <w:lang w:val="en-US" w:eastAsia="zh-CN"/>
-        </w:rPr>
-        <w:t>识别黄金批发业务中两类高频问题：新人销售依赖师带徒，产品知识和异议处理话术掌握周期长；私域咨询存在响应不及时、高频问题重复占用人工的问题。据此将项目定位为“RAG 智能客服 + 销售培训对练系统”，优先覆盖私域咨询承接与新人培训两类场景，数字人作为后续培训沉浸感和品牌展示的增强能力。</w:t>
+          <w:sz w:val="20"/>
+          <w:szCs w:val="20"/>
+          <w:lang w:val="en-US" w:eastAsia="zh-CN"/>
+        </w:rPr>
+        <w:t>RAG 销售培训与客服系统</w:t>
       </w:r>
     </w:p>
     <w:p>
@@ -2250,30 +2273,32 @@
         <w:textAlignment w:val="auto"/>
         <w:rPr>
           <w:rFonts w:hint="eastAsia" w:ascii="MiSans" w:hAnsi="MiSans" w:eastAsia="MiSans" w:cs="MiSans"/>
-          <w:sz w:val="17"/>
-          <w:szCs w:val="17"/>
-          <w:lang w:val="en-US" w:eastAsia="zh-CN"/>
-        </w:rPr>
-      </w:pPr>
-      <w:r>
-        <w:rPr>
-          <w:rFonts w:hint="eastAsia" w:ascii="MiSans Heavy" w:hAnsi="MiSans Heavy" w:eastAsia="MiSans Heavy" w:cs="MiSans Heavy"/>
           <w:b/>
           <w:bCs/>
           <w:sz w:val="17"/>
           <w:szCs w:val="17"/>
           <w:lang w:val="en-US" w:eastAsia="zh-CN"/>
         </w:rPr>
-        <w:t>• AI 能力设计与知识工程：</w:t>
-      </w:r>
-      <w:r>
-        <w:rPr>
-          <w:rFonts w:hint="eastAsia" w:ascii="MiSans Light" w:hAnsi="MiSans Light" w:eastAsia="MiSans Light" w:cs="MiSans Light"/>
-          <w:sz w:val="17"/>
-          <w:szCs w:val="17"/>
-          <w:lang w:val="en-US" w:eastAsia="zh-CN"/>
-        </w:rPr>
-        <w:t>主导黄金产品知识库结构化设计，将知识拆分为产品知识、销售话术、异议处理三层；设计基于 RAG 的问答链路和五段式对话状态机，覆盖需求识别、产品推荐、异议处理与转人工判断；通过 Prompt Engineering 约束品牌话术、价格边界和合规表达，降低大模型幻觉和错误承诺风险。</w:t>
+      </w:pPr>
+      <w:r>
+        <w:rPr>
+          <w:rFonts w:hint="eastAsia" w:ascii="MiSans Heavy" w:hAnsi="MiSans Heavy" w:eastAsia="MiSans Heavy" w:cs="MiSans Heavy"/>
+          <w:b/>
+          <w:bCs/>
+          <w:sz w:val="17"/>
+          <w:szCs w:val="17"/>
+          <w:lang w:val="en-US" w:eastAsia="zh-CN"/>
+        </w:rPr>
+        <w:t>• 背景与洞察：</w:t>
+      </w:r>
+      <w:r>
+        <w:rPr>
+          <w:rFonts w:hint="eastAsia" w:ascii="MiSans Light" w:hAnsi="MiSans Light" w:eastAsia="MiSans Light" w:cs="MiSans Light"/>
+          <w:sz w:val="17"/>
+          <w:szCs w:val="17"/>
+          <w:lang w:val="en-US" w:eastAsia="zh-CN"/>
+        </w:rPr>
+        <w:t>识别黄金批发业务中两类高频问题：新人销售依赖师带徒，产品知识和异议处理话术掌握周期长；私域咨询存在响应不及时、高频问题重复占用人工的问题。据此将项目定位为“RAG 智能客服 + 销售培训对练系统”，优先覆盖私域咨询承接与新人培训两类场景，数字人作为后续培训沉浸感和品牌展示的增强能力。</w:t>
       </w:r>
     </w:p>
     <w:p>
@@ -2299,7 +2324,7 @@
         <w:jc w:val="both"/>
         <w:textAlignment w:val="auto"/>
         <w:rPr>
-          <w:rFonts w:hint="eastAsia" w:ascii="MiSans Light" w:hAnsi="MiSans Light" w:eastAsia="MiSans Light" w:cs="MiSans Light"/>
+          <w:rFonts w:hint="eastAsia" w:ascii="MiSans" w:hAnsi="MiSans" w:eastAsia="MiSans" w:cs="MiSans"/>
           <w:sz w:val="17"/>
           <w:szCs w:val="17"/>
           <w:lang w:val="en-US" w:eastAsia="zh-CN"/>
@@ -2314,16 +2339,16 @@
           <w:szCs w:val="17"/>
           <w:lang w:val="en-US" w:eastAsia="zh-CN"/>
         </w:rPr>
-        <w:t>• 技术选型与效果评估：</w:t>
-      </w:r>
-      <w:r>
-        <w:rPr>
-          <w:rFonts w:hint="eastAsia" w:ascii="MiSans Light" w:hAnsi="MiSans Light" w:eastAsia="MiSans Light" w:cs="MiSans Light"/>
-          <w:sz w:val="17"/>
-          <w:szCs w:val="17"/>
-          <w:lang w:val="en-US" w:eastAsia="zh-CN"/>
-        </w:rPr>
-        <w:t>围绕知识库问答准确率、系统接入成本、私域客服集成效率和后续数字人扩展能力，对比多种 AI 客服 / 数字人方案，最终选择以 RAG 智能问答为 MVP 核心、数字人为后续增强层的技术路径；设计 120 题分场景评估集，覆盖产品知识准确性、话术合规性、异议处理质量三类维度。</w:t>
+        <w:t>• AI 能力设计与知识工程：</w:t>
+      </w:r>
+      <w:r>
+        <w:rPr>
+          <w:rFonts w:hint="eastAsia" w:ascii="MiSans Light" w:hAnsi="MiSans Light" w:eastAsia="MiSans Light" w:cs="MiSans Light"/>
+          <w:sz w:val="17"/>
+          <w:szCs w:val="17"/>
+          <w:lang w:val="en-US" w:eastAsia="zh-CN"/>
+        </w:rPr>
+        <w:t>主导黄金产品知识库结构化设计，将知识拆分为产品知识、销售话术、异议处理三层；设计基于 RAG 的问答链路和五段式对话状态机，覆盖需求识别、产品推荐、异议处理与转人工判断；通过 Prompt Engineering 约束品牌话术、价格边界和合规表达，降低大模型幻觉和错误承诺风险。</w:t>
       </w:r>
     </w:p>
     <w:p>
@@ -2364,27 +2389,16 @@
           <w:szCs w:val="17"/>
           <w:lang w:val="en-US" w:eastAsia="zh-CN"/>
         </w:rPr>
-        <w:t>• 评估与迭代：</w:t>
-      </w:r>
-      <w:r>
-        <w:rPr>
-          <w:rFonts w:hint="eastAsia" w:ascii="MiSans Light" w:hAnsi="MiSans Light" w:eastAsia="MiSans Light" w:cs="MiSans Light"/>
-          <w:sz w:val="17"/>
-          <w:szCs w:val="17"/>
-          <w:lang w:val="en-US" w:eastAsia="zh-CN"/>
-        </w:rPr>
-        <w:t>设计 120 题分场景评估集，覆盖产品知识准确性、话术合规性</w:t>
-      </w:r>
-      <w:bookmarkStart w:id="0" w:name="_GoBack"/>
-      <w:bookmarkEnd w:id="0"/>
-      <w:r>
-        <w:rPr>
-          <w:rFonts w:hint="eastAsia" w:ascii="MiSans Light" w:hAnsi="MiSans Light" w:eastAsia="MiSans Light" w:cs="MiSans Light"/>
-          <w:sz w:val="17"/>
-          <w:szCs w:val="17"/>
-          <w:lang w:val="en-US" w:eastAsia="zh-CN"/>
-        </w:rPr>
-        <w:t>、异议处理质量三类维度；结合人工抽检、badcase 归因和转人工记录，持续优化知识库结构、Prompt 策略与转人工规则，推动系统从“能回答”迭代到“答得准、可转接、可追踪”。</w:t>
+        <w:t>• 技术选型与效果评估：</w:t>
+      </w:r>
+      <w:r>
+        <w:rPr>
+          <w:rFonts w:hint="eastAsia" w:ascii="MiSans Light" w:hAnsi="MiSans Light" w:eastAsia="MiSans Light" w:cs="MiSans Light"/>
+          <w:sz w:val="17"/>
+          <w:szCs w:val="17"/>
+          <w:lang w:val="en-US" w:eastAsia="zh-CN"/>
+        </w:rPr>
+        <w:t>围绕知识库问答准确率、系统接入成本、私域客服集成效率和后续数字人扩展能力，对比多种 AI 客服 / 数字人方案，最终选择以 RAG 智能问答为 MVP 核心、数字人为后续增强层的技术路径；设计 120 题分场景评估集，覆盖产品知识准确性、话术合规性、异议处理质量三类维度。</w:t>
       </w:r>
     </w:p>
     <w:p>
@@ -2425,6 +2439,56 @@
           <w:szCs w:val="17"/>
           <w:lang w:val="en-US" w:eastAsia="zh-CN"/>
         </w:rPr>
+        <w:t>• 评估与迭代：</w:t>
+      </w:r>
+      <w:r>
+        <w:rPr>
+          <w:rFonts w:hint="eastAsia" w:ascii="MiSans Light" w:hAnsi="MiSans Light" w:eastAsia="MiSans Light" w:cs="MiSans Light"/>
+          <w:sz w:val="17"/>
+          <w:szCs w:val="17"/>
+          <w:lang w:val="en-US" w:eastAsia="zh-CN"/>
+        </w:rPr>
+        <w:t>设计 120 题分场景评估集，覆盖产品知识准确性、话术合规性、异议处理质量三类维度；结合人工抽检、badcase 归因和转人工记录，持续优化知识库结构、Prompt 策略与转人工规则，推动系统从“能回答”迭代到“答得准、可转接、可追踪”。</w:t>
+      </w:r>
+    </w:p>
+    <w:p>
+      <w:pPr>
+        <w:keepNext w:val="0"/>
+        <w:keepLines w:val="0"/>
+        <w:pageBreakBefore w:val="0"/>
+        <w:widowControl w:val="0"/>
+        <w:tabs>
+          <w:tab w:val="left" w:pos="9113"/>
+        </w:tabs>
+        <w:kinsoku/>
+        <w:wordWrap/>
+        <w:overflowPunct/>
+        <w:topLinePunct w:val="0"/>
+        <w:autoSpaceDE w:val="0"/>
+        <w:autoSpaceDN w:val="0"/>
+        <w:bidi w:val="0"/>
+        <w:adjustRightInd/>
+        <w:snapToGrid/>
+        <w:spacing w:before="0" w:beforeLines="20" w:after="0" w:afterLines="20" w:line="280" w:lineRule="exact"/>
+        <w:ind w:left="130"/>
+        <w:jc w:val="both"/>
+        <w:textAlignment w:val="auto"/>
+        <w:rPr>
+          <w:rFonts w:hint="eastAsia" w:ascii="MiSans Light" w:hAnsi="MiSans Light" w:eastAsia="MiSans Light" w:cs="MiSans Light"/>
+          <w:sz w:val="17"/>
+          <w:szCs w:val="17"/>
+          <w:lang w:val="en-US" w:eastAsia="zh-CN"/>
+        </w:rPr>
+      </w:pPr>
+      <w:r>
+        <w:rPr>
+          <w:rFonts w:hint="eastAsia" w:ascii="MiSans Heavy" w:hAnsi="MiSans Heavy" w:eastAsia="MiSans Heavy" w:cs="MiSans Heavy"/>
+          <w:b/>
+          <w:bCs/>
+          <w:sz w:val="17"/>
+          <w:szCs w:val="17"/>
+          <w:lang w:val="en-US" w:eastAsia="zh-CN"/>
+        </w:rPr>
         <w:t>• 项目成果：</w:t>
       </w:r>
       <w:r>
@@ -2434,7 +2498,7 @@
           <w:szCs w:val="17"/>
           <w:lang w:val="en-US" w:eastAsia="zh-CN"/>
         </w:rPr>
-        <w:t>5个月完成MVP交付，覆盖内部500+销售人员；新人培训周期缩短约60%（约1个月→约2周）；私域响应效率提升2倍；专业讲解准确率达95%（120题 LLM 评估集）；展厅客户转化率提升约15%（4家批发展示展厅前后各3个月对比）。</w:t>
+        <w:t>5个月完成MVP交付，覆盖内部500+销售人员；新人培训周期缩短约60%（约1个月→约2周）；私域响应效率提升2倍；专业讲解准确率达95%（120 题分场景人工评估集）；展厅客户转化率提升约15%（4家批发展示展厅前后各3个月对比）。</w:t>
       </w:r>
     </w:p>
     <w:p>

</xml_diff>

<commit_message>
Update site from May resume
</commit_message>
<xml_diff>
--- a/resume-ai-product-manager.docx
+++ b/resume-ai-product-manager.docx
@@ -670,7 +670,7 @@
           <w:sz w:val="17"/>
           <w:szCs w:val="17"/>
         </w:rPr>
-        <w:t xml:space="preserve"> 具备从产品定义到技术落地的独立判断能力；主导 AI 创作工作流、RAG 三层检索架构、对话状态机与 Prompt Engineering 的产品设计与落地；自主完成 LLM / Embedding 模型选型评测与检索效果调优，RAG 召回准确率达 92%，RAG 销售系统专业讲解准确率达 95%。</w:t>
+        <w:t xml:space="preserve"> 具备从产品定义到技术落地的独立判断能力；主导 AI 内容生产工作流设计、RAG 三层检索架构、对话状态机与 Prompt Engineering 落地；自主完成 LLM/Embedding 选型评测与 RAG 召回策略优化，RAG 召回准确率达 92%，智能客服专业问答准确率达 95%。</w:t>
       </w:r>
     </w:p>
     <w:p>
@@ -1073,26 +1073,7 @@
           <w:sz w:val="22"/>
           <w:szCs w:val="22"/>
         </w:rPr>
-        <w:t xml:space="preserve">| </w:t>
-      </w:r>
-      <w:r>
-        <w:rPr>
-          <w:rFonts w:hint="eastAsia" w:ascii="MiSans Heavy" w:hAnsi="MiSans Heavy" w:eastAsia="MiSans Heavy" w:cs="MiSans Heavy"/>
-          <w:b/>
-          <w:sz w:val="22"/>
-          <w:szCs w:val="22"/>
-          <w:lang w:val="en-US" w:eastAsia="zh-CN"/>
-        </w:rPr>
-        <w:t>AI</w:t>
-      </w:r>
-      <w:r>
-        <w:rPr>
-          <w:rFonts w:hint="eastAsia" w:ascii="MiSans Heavy" w:hAnsi="MiSans Heavy" w:eastAsia="MiSans Heavy" w:cs="MiSans Heavy"/>
-          <w:b/>
-          <w:sz w:val="22"/>
-          <w:szCs w:val="22"/>
-        </w:rPr>
-        <w:t>产品经理</w:t>
+        <w:t>| 产品经理</w:t>
       </w:r>
       <w:r>
         <w:rPr>
@@ -1360,7 +1341,7 @@
           <w:szCs w:val="16"/>
           <w:lang w:val="en-US" w:eastAsia="zh-CN"/>
         </w:rPr>
-        <w:t>● AI 全链路视觉工作流设计：</w:t>
+        <w:t>● AI 全链路视觉工作流产品方案设计：</w:t>
       </w:r>
       <w:r>
         <w:rPr>
@@ -1619,6 +1600,7 @@
           <w:lang w:val="en-US" w:eastAsia="zh-CN"/>
         </w:rPr>
       </w:pPr>
+      <w:bookmarkStart w:id="0" w:name="_GoBack"/>
       <w:r>
         <w:rPr>
           <w:rFonts w:hint="eastAsia" w:ascii="MiSans Heavy" w:hAnsi="MiSans Heavy" w:eastAsia="MiSans Heavy" w:cs="MiSans Heavy"/>
@@ -1637,7 +1619,17 @@
           <w:szCs w:val="15"/>
           <w:lang w:val="en-US" w:eastAsia="zh-CN"/>
         </w:rPr>
-        <w:t>负责“订阅 + 积分”的商业化方案设计，将积分消耗与模型调用成本挂钩，支持用户按质量档和速度档选择生成能力；参与 PMF 验证和早期付费转化方案讨论，平台完成 8 家早期付费/试点影视工作室签约，验证外部工作室付费意愿；模型调用层目标毛利率约 40%</w:t>
+        <w:t>负责“订阅 + 积分”的商业化方案设计，将积分消耗与模型调用成本挂钩，支持用户按质量档和速度档选择生成能力；参与 PMF 验证和早期</w:t>
+      </w:r>
+      <w:bookmarkEnd w:id="0"/>
+      <w:r>
+        <w:rPr>
+          <w:rFonts w:hint="eastAsia" w:ascii="MiSans Light" w:hAnsi="MiSans Light" w:eastAsia="MiSans Light" w:cs="MiSans Light"/>
+          <w:sz w:val="15"/>
+          <w:szCs w:val="15"/>
+          <w:lang w:val="en-US" w:eastAsia="zh-CN"/>
+        </w:rPr>
+        <w:t>付费转化方案讨论，平台完成 8 家付费影视工作室签约，目标毛利率 40% 以上。</w:t>
       </w:r>
     </w:p>
     <w:p>
@@ -1663,7 +1655,7 @@
         <w:jc w:val="both"/>
         <w:textAlignment w:val="auto"/>
         <w:rPr>
-          <w:rFonts w:hint="default" w:ascii="MiSans Light" w:hAnsi="MiSans Light" w:eastAsia="MiSans Light" w:cs="MiSans Light"/>
+          <w:rFonts w:hint="eastAsia" w:ascii="MiSans Light" w:hAnsi="MiSans Light" w:eastAsia="MiSans Light" w:cs="MiSans Light"/>
           <w:sz w:val="15"/>
           <w:szCs w:val="15"/>
           <w:lang w:val="en-US" w:eastAsia="zh-CN"/>
@@ -1696,7 +1688,7 @@
           <w:szCs w:val="15"/>
           <w:lang w:val="en-US" w:eastAsia="zh-CN"/>
         </w:rPr>
-        <w:t>完成从0到1可用产品交付；分镜策划效率提升约3倍，内容生产周期缩短约50%；RAG召回准确率92%（口语化指令召回从60%提升至92%）；批注AI建议一键采纳率78%；辅助增量作品斩获B站AI动画大赛二等奖1项、三等奖2项；1部作品入围第七届海南岛国际电影节AI电影季、第十六届北京国际电影节AIGC电影单元；另有作品获海螺AI × WAIFF（世界人工智能电影节）最佳叙事奖。完成商业化冷启动，签约 8 家早期付费/试点影视工作室，验证外部工作室付费意愿；采用「订阅+积分」双轨变现模式，积分消耗与模型调用成本直接挂钩，模型调用层目标毛利率约 40%，通过积分制将生成消耗与模型 API 成本挂钩。</w:t>
+        <w:t>完成从0到1可用产品交付；分镜策划效率提升约3倍，内容生产周期缩短约50%；RAG召回准确率92%（口语化指令召回从60%提升至92%）；批注AI建议一键采纳率78%；辅助增量作品斩获B站AI动画大赛二等奖1项、三等奖2项；1部作品入围第七届海南岛国际电影节AI电影季、第十六届北京国际电影节AIGC电影单元；另有作品获海螺AI × WAIFF（世界人工智能电影节）最佳叙事奖。完成商业化冷启动，签约8家付费影视工作室；采用「订阅+积分」双轨变现模式，积分消耗与模型调用成本直接挂钩，平台目标毛利率40%以上。</w:t>
       </w:r>
     </w:p>
     <w:p>
@@ -1767,7 +1759,7 @@
           <w:szCs w:val="20"/>
           <w:lang w:val="en-US" w:eastAsia="zh-CN"/>
         </w:rPr>
-        <w:t>项目二：AI 影视供需匹配平台</w:t>
+        <w:t>项目二：AI影视承接平台</w:t>
       </w:r>
       <w:r>
         <w:rPr>
@@ -1903,7 +1895,7 @@
           <w:szCs w:val="16"/>
           <w:lang w:val="en-US" w:eastAsia="zh-CN"/>
         </w:rPr>
-        <w:t>●  AI 需求理解与结构化设计：</w:t>
+        <w:t>● 2周内独立交付双角色完整产品：</w:t>
       </w:r>
       <w:r>
         <w:rPr>
@@ -1913,7 +1905,7 @@
           <w:szCs w:val="15"/>
           <w:lang w:val="en-US" w:eastAsia="zh-CN"/>
         </w:rPr>
-        <w:t xml:space="preserve"> 设计需求发布流程中的 AI 辅助填写能力，将甲方的口语化创作想法转化为项目背景、视觉风格、用途场景、交付要求等结构化描述，降低非专业甲方发布需求的表达门槛，并提升后续匹配质量。</w:t>
+        <w:t xml:space="preserve"> 覆盖项目发布、创作者广场、合同签署、里程碑交付审核全链路，内测后持续迭代</w:t>
       </w:r>
     </w:p>
     <w:p>
@@ -1956,7 +1948,7 @@
           <w:szCs w:val="16"/>
           <w:lang w:val="en-US" w:eastAsia="zh-CN"/>
         </w:rPr>
-        <w:t>● 创作者能力标签体系设计：</w:t>
+        <w:t>● 基于内测反馈优化创作者匹配体验：</w:t>
       </w:r>
       <w:r>
         <w:rPr>
@@ -1966,7 +1958,7 @@
           <w:szCs w:val="15"/>
           <w:lang w:val="en-US" w:eastAsia="zh-CN"/>
         </w:rPr>
-        <w:t xml:space="preserve"> 围绕作品风格、擅长题材、使用工具、交付类型、过往案例等维度设计创作者能力标签；结合创作者上传作品与个人简介生成能力画像，为匹配算法提供可计算的特征基础。</w:t>
+        <w:t xml:space="preserve"> 引入AI自动打标签机制，依据创作者上传作品生成能力标签，甲方发布需求后系统自动匹配相关创作者，点击卡片可直接查看匹配作品，显著降低甲方筛选成本。</w:t>
       </w:r>
     </w:p>
     <w:p>
@@ -2009,17 +2001,27 @@
           <w:szCs w:val="16"/>
           <w:lang w:val="en-US" w:eastAsia="zh-CN"/>
         </w:rPr>
-        <w:t>● AI 智能匹配与决策面板：</w:t>
-      </w:r>
-      <w:r>
-        <w:rPr>
-          <w:rFonts w:hint="eastAsia" w:ascii="MiSans Light" w:hAnsi="MiSans Light" w:eastAsia="MiSans Light" w:cs="MiSans Light"/>
+        <w:t>● 设计灵活托管付款机制：</w:t>
+      </w:r>
+      <w:r>
+        <w:rPr>
+          <w:rFonts w:hint="eastAsia" w:ascii="MiSans" w:hAnsi="MiSans" w:eastAsia="MiSans" w:cs="MiSans"/>
           <w:color w:val="auto"/>
           <w:sz w:val="15"/>
           <w:szCs w:val="15"/>
           <w:lang w:val="en-US" w:eastAsia="zh-CN"/>
         </w:rPr>
-        <w:t>设计创作者匹配评分机制，基于项目需求、品类、风格标签、工具能力与作品相关性生成匹配分，并在甲方侧展示推荐理由、匹配作品与创作者能力摘要，帮助甲方从“人工浏览筛选”转为“AI 推荐 + 人工决策”。</w:t>
+        <w:t xml:space="preserve"> </w:t>
+      </w:r>
+      <w:r>
+        <w:rPr>
+          <w:rFonts w:hint="eastAsia" w:ascii="MiSans Light" w:hAnsi="MiSans Light" w:eastAsia="MiSans Light" w:cs="MiSans Light"/>
+          <w:color w:val="auto"/>
+          <w:sz w:val="15"/>
+          <w:szCs w:val="15"/>
+          <w:lang w:val="en-US" w:eastAsia="zh-CN"/>
+        </w:rPr>
+        <w:t>支持甲乙双方自定义付款比例与里程碑节点，资金由平台托管、按节点释放。</w:t>
       </w:r>
     </w:p>
     <w:p>
@@ -2052,27 +2054,94 @@
           <w:lang w:val="en-US" w:eastAsia="zh-CN"/>
         </w:rPr>
       </w:pPr>
-      <w:r>
-        <w:rPr>
-          <w:rFonts w:hint="eastAsia" w:ascii="MiSans" w:hAnsi="MiSans" w:eastAsia="MiSans" w:cs="MiSans"/>
-          <w:b/>
+    </w:p>
+    <w:p>
+      <w:pPr>
+        <w:tabs>
+          <w:tab w:val="left" w:pos="9084"/>
+          <w:tab w:val="left" w:pos="9479"/>
+        </w:tabs>
+        <w:spacing w:before="24" w:beforeLines="10" w:after="24" w:afterLines="10" w:line="280" w:lineRule="exact"/>
+        <w:ind w:left="130"/>
+        <w:jc w:val="both"/>
+        <w:rPr>
+          <w:rFonts w:hint="eastAsia" w:ascii="MiSans" w:hAnsi="MiSans" w:eastAsia="MiSans" w:cs="MiSans"/>
+          <w:b/>
+          <w:sz w:val="20"/>
+          <w:szCs w:val="20"/>
+          <w:lang w:val="en-US" w:eastAsia="zh-CN"/>
+        </w:rPr>
+      </w:pPr>
+      <w:r>
+        <w:rPr>
+          <w:rFonts w:hint="eastAsia" w:ascii="MiSans" w:hAnsi="MiSans" w:eastAsia="MiSans" w:cs="MiSans"/>
+          <w:b/>
+          <w:sz w:val="22"/>
+          <w:szCs w:val="22"/>
+          <w:lang w:val="en-US" w:eastAsia="zh-CN"/>
+        </w:rPr>
+        <w:t xml:space="preserve">深圳华禧文化 | 产品经理 </w:t>
+      </w:r>
+      <w:r>
+        <w:rPr>
+          <w:rFonts w:hint="eastAsia" w:ascii="MiSans" w:hAnsi="MiSans" w:eastAsia="MiSans" w:cs="MiSans"/>
+          <w:b w:val="0"/>
           <w:bCs/>
-          <w:color w:val="auto"/>
+          <w:color w:val="404040" w:themeColor="text1" w:themeTint="BF"/>
+          <w:sz w:val="20"/>
+          <w:szCs w:val="20"/>
+          <w:lang w:val="en-US" w:eastAsia="zh-CN"/>
+          <w14:textFill>
+            <w14:solidFill>
+              <w14:schemeClr w14:val="tx1">
+                <w14:lumMod w14:val="75000"/>
+                <w14:lumOff w14:val="25000"/>
+              </w14:schemeClr>
+            </w14:solidFill>
+          </w14:textFill>
+        </w:rPr>
+        <w:t xml:space="preserve"> </w:t>
+      </w:r>
+      <w:r>
+        <w:rPr>
+          <w:rFonts w:hint="eastAsia" w:ascii="MiSans" w:hAnsi="MiSans" w:eastAsia="MiSans" w:cs="MiSans"/>
+          <w:b/>
+          <w:bCs w:val="0"/>
+          <w:color w:val="404040" w:themeColor="text1" w:themeTint="BF"/>
           <w:sz w:val="16"/>
           <w:szCs w:val="16"/>
           <w:lang w:val="en-US" w:eastAsia="zh-CN"/>
-        </w:rPr>
-        <w:t>● 双角色交易闭环设计：</w:t>
-      </w:r>
-      <w:r>
-        <w:rPr>
-          <w:rFonts w:hint="eastAsia" w:ascii="MiSans Light" w:hAnsi="MiSans Light" w:eastAsia="MiSans Light" w:cs="MiSans Light"/>
-          <w:color w:val="auto"/>
-          <w:sz w:val="15"/>
-          <w:szCs w:val="15"/>
-          <w:lang w:val="en-US" w:eastAsia="zh-CN"/>
-        </w:rPr>
-        <w:t>2 周内独立完成需求方与创作者双角色 MVP，覆盖需求发布、应征投标、作品集查看、甲方筛选、合同/托管付款、里程碑交付审核等流程，支撑内测用户完成完整供需匹配闭环。</w:t>
+          <w14:textFill>
+            <w14:solidFill>
+              <w14:schemeClr w14:val="tx1">
+                <w14:lumMod w14:val="75000"/>
+                <w14:lumOff w14:val="25000"/>
+              </w14:schemeClr>
+            </w14:solidFill>
+          </w14:textFill>
+        </w:rPr>
+        <w:t xml:space="preserve">(黄金 ToB 批发企业，内部推进数字化与 AI 赋能) </w:t>
+      </w:r>
+      <w:r>
+        <w:rPr>
+          <w:rFonts w:hint="eastAsia" w:ascii="MiSans" w:hAnsi="MiSans" w:eastAsia="MiSans" w:cs="MiSans"/>
+          <w:b/>
+          <w:bCs w:val="0"/>
+          <w:sz w:val="17"/>
+          <w:szCs w:val="17"/>
+          <w:lang w:val="en-US" w:eastAsia="zh-CN"/>
+        </w:rPr>
+        <w:t xml:space="preserve">                                                 </w:t>
+      </w:r>
+      <w:r>
+        <w:rPr>
+          <w:rFonts w:hint="eastAsia" w:ascii="MiSans" w:hAnsi="MiSans" w:eastAsia="MiSans" w:cs="MiSans"/>
+          <w:b/>
+          <w:sz w:val="22"/>
+          <w:szCs w:val="22"/>
+          <w:lang w:val="en-US" w:eastAsia="zh-CN"/>
+        </w:rPr>
+        <w:t>2024.07-2025.09</w:t>
       </w:r>
     </w:p>
     <w:p>
@@ -2098,26 +2167,7 @@
         <w:jc w:val="both"/>
         <w:textAlignment w:val="auto"/>
         <w:rPr>
-          <w:rFonts w:hint="eastAsia" w:ascii="MiSans Light" w:hAnsi="MiSans Light" w:eastAsia="MiSans Light" w:cs="MiSans Light"/>
-          <w:color w:val="auto"/>
-          <w:sz w:val="15"/>
-          <w:szCs w:val="15"/>
-          <w:lang w:val="en-US" w:eastAsia="zh-CN"/>
-        </w:rPr>
-      </w:pPr>
-    </w:p>
-    <w:p>
-      <w:pPr>
-        <w:tabs>
-          <w:tab w:val="left" w:pos="9084"/>
-          <w:tab w:val="left" w:pos="9479"/>
-        </w:tabs>
-        <w:spacing w:before="24" w:beforeLines="10" w:after="24" w:afterLines="10" w:line="280" w:lineRule="exact"/>
-        <w:ind w:left="130"/>
-        <w:jc w:val="both"/>
-        <w:rPr>
-          <w:rFonts w:hint="eastAsia" w:ascii="MiSans" w:hAnsi="MiSans" w:eastAsia="MiSans" w:cs="MiSans"/>
-          <w:b/>
+          <w:rFonts w:hint="eastAsia" w:ascii="MiSans Heavy" w:hAnsi="MiSans Heavy" w:eastAsia="MiSans Heavy" w:cs="MiSans Heavy"/>
           <w:sz w:val="20"/>
           <w:szCs w:val="20"/>
           <w:lang w:val="en-US" w:eastAsia="zh-CN"/>
@@ -2125,74 +2175,14 @@
       </w:pPr>
       <w:r>
         <w:rPr>
-          <w:rFonts w:hint="eastAsia" w:ascii="MiSans" w:hAnsi="MiSans" w:eastAsia="MiSans" w:cs="MiSans"/>
-          <w:b/>
-          <w:sz w:val="22"/>
-          <w:szCs w:val="22"/>
-          <w:lang w:val="en-US" w:eastAsia="zh-CN"/>
-        </w:rPr>
-        <w:t xml:space="preserve">深圳华禧文化 | AI产品经理 </w:t>
-      </w:r>
-      <w:r>
-        <w:rPr>
-          <w:rFonts w:hint="eastAsia" w:ascii="MiSans" w:hAnsi="MiSans" w:eastAsia="MiSans" w:cs="MiSans"/>
-          <w:b w:val="0"/>
+          <w:rFonts w:hint="eastAsia" w:ascii="MiSans Heavy" w:hAnsi="MiSans Heavy" w:eastAsia="MiSans Heavy" w:cs="MiSans Heavy"/>
+          <w:b/>
           <w:bCs/>
-          <w:color w:val="404040" w:themeColor="text1" w:themeTint="BF"/>
           <w:sz w:val="20"/>
           <w:szCs w:val="20"/>
           <w:lang w:val="en-US" w:eastAsia="zh-CN"/>
-          <w14:textFill>
-            <w14:solidFill>
-              <w14:schemeClr w14:val="tx1">
-                <w14:lumMod w14:val="75000"/>
-                <w14:lumOff w14:val="25000"/>
-              </w14:schemeClr>
-            </w14:solidFill>
-          </w14:textFill>
-        </w:rPr>
-        <w:t xml:space="preserve"> </w:t>
-      </w:r>
-      <w:r>
-        <w:rPr>
-          <w:rFonts w:hint="eastAsia" w:ascii="MiSans" w:hAnsi="MiSans" w:eastAsia="MiSans" w:cs="MiSans"/>
-          <w:b/>
-          <w:bCs w:val="0"/>
-          <w:color w:val="404040" w:themeColor="text1" w:themeTint="BF"/>
-          <w:sz w:val="16"/>
-          <w:szCs w:val="16"/>
-          <w:lang w:val="en-US" w:eastAsia="zh-CN"/>
-          <w14:textFill>
-            <w14:solidFill>
-              <w14:schemeClr w14:val="tx1">
-                <w14:lumMod w14:val="75000"/>
-                <w14:lumOff w14:val="25000"/>
-              </w14:schemeClr>
-            </w14:solidFill>
-          </w14:textFill>
-        </w:rPr>
-        <w:t xml:space="preserve">(黄金 ToB 批发企业，内部推进数字化与 AI 赋能) </w:t>
-      </w:r>
-      <w:r>
-        <w:rPr>
-          <w:rFonts w:hint="eastAsia" w:ascii="MiSans" w:hAnsi="MiSans" w:eastAsia="MiSans" w:cs="MiSans"/>
-          <w:b/>
-          <w:bCs w:val="0"/>
-          <w:sz w:val="17"/>
-          <w:szCs w:val="17"/>
-          <w:lang w:val="en-US" w:eastAsia="zh-CN"/>
-        </w:rPr>
-        <w:t xml:space="preserve">                                                 </w:t>
-      </w:r>
-      <w:r>
-        <w:rPr>
-          <w:rFonts w:hint="eastAsia" w:ascii="MiSans" w:hAnsi="MiSans" w:eastAsia="MiSans" w:cs="MiSans"/>
-          <w:b/>
-          <w:sz w:val="22"/>
-          <w:szCs w:val="22"/>
-          <w:lang w:val="en-US" w:eastAsia="zh-CN"/>
-        </w:rPr>
-        <w:t>2024.07-2025.09</w:t>
+        </w:rPr>
+        <w:t>项目一：RAG 智能客服与销售培训系统｜轻量 Agentic RAG 架构设计</w:t>
       </w:r>
     </w:p>
     <w:p>
@@ -2218,35 +2208,33 @@
         <w:jc w:val="both"/>
         <w:textAlignment w:val="auto"/>
         <w:rPr>
-          <w:rFonts w:hint="eastAsia" w:ascii="MiSans Heavy" w:hAnsi="MiSans Heavy" w:eastAsia="MiSans Heavy" w:cs="MiSans Heavy"/>
-          <w:sz w:val="20"/>
-          <w:szCs w:val="20"/>
-          <w:lang w:val="en-US" w:eastAsia="zh-CN"/>
-        </w:rPr>
-      </w:pPr>
-      <w:r>
-        <w:rPr>
-          <w:rFonts w:hint="eastAsia" w:ascii="MiSans Heavy" w:hAnsi="MiSans Heavy" w:eastAsia="MiSans Heavy" w:cs="MiSans Heavy"/>
+          <w:rFonts w:hint="eastAsia" w:ascii="MiSans" w:hAnsi="MiSans" w:eastAsia="MiSans" w:cs="MiSans"/>
           <w:b/>
           <w:bCs/>
-          <w:sz w:val="20"/>
-          <w:szCs w:val="20"/>
-          <w:lang w:val="en-US" w:eastAsia="zh-CN"/>
-        </w:rPr>
-        <w:t>项目一：</w:t>
-      </w:r>
-      <w:bookmarkStart w:id="0" w:name="_GoBack"/>
-      <w:bookmarkEnd w:id="0"/>
+          <w:sz w:val="17"/>
+          <w:szCs w:val="17"/>
+          <w:lang w:val="en-US" w:eastAsia="zh-CN"/>
+        </w:rPr>
+      </w:pPr>
       <w:r>
         <w:rPr>
           <w:rFonts w:hint="eastAsia" w:ascii="MiSans Heavy" w:hAnsi="MiSans Heavy" w:eastAsia="MiSans Heavy" w:cs="MiSans Heavy"/>
           <w:b/>
           <w:bCs/>
-          <w:sz w:val="20"/>
-          <w:szCs w:val="20"/>
-          <w:lang w:val="en-US" w:eastAsia="zh-CN"/>
-        </w:rPr>
-        <w:t>RAG 销售培训与客服系统</w:t>
+          <w:sz w:val="17"/>
+          <w:szCs w:val="17"/>
+          <w:lang w:val="en-US" w:eastAsia="zh-CN"/>
+        </w:rPr>
+        <w:t>• 背景与洞察：</w:t>
+      </w:r>
+      <w:r>
+        <w:rPr>
+          <w:rFonts w:hint="eastAsia" w:ascii="MiSans Light" w:hAnsi="MiSans Light" w:eastAsia="MiSans Light" w:cs="MiSans Light"/>
+          <w:sz w:val="17"/>
+          <w:szCs w:val="17"/>
+          <w:lang w:val="en-US" w:eastAsia="zh-CN"/>
+        </w:rPr>
+        <w:t>识别黄金批发业务中两类高频问题：新人销售依赖师带徒，产品知识和异议处理话术掌握周期长；私域咨询存在响应不及时、高频问题重复占用人工的问题。由于该场景不只是单轮 FAQ 问答，还涉及需求识别、产品推荐、异议处理、合规边界和转人工判断，因此项目立项初期即按轻量 Agentic RAG 思路设计，优先覆盖私域咨询承接与新人培训对练两类场景。</w:t>
       </w:r>
     </w:p>
     <w:p>
@@ -2273,32 +2261,30 @@
         <w:textAlignment w:val="auto"/>
         <w:rPr>
           <w:rFonts w:hint="eastAsia" w:ascii="MiSans" w:hAnsi="MiSans" w:eastAsia="MiSans" w:cs="MiSans"/>
+          <w:sz w:val="17"/>
+          <w:szCs w:val="17"/>
+          <w:lang w:val="en-US" w:eastAsia="zh-CN"/>
+        </w:rPr>
+      </w:pPr>
+      <w:r>
+        <w:rPr>
+          <w:rFonts w:hint="eastAsia" w:ascii="MiSans Heavy" w:hAnsi="MiSans Heavy" w:eastAsia="MiSans Heavy" w:cs="MiSans Heavy"/>
           <w:b/>
           <w:bCs/>
           <w:sz w:val="17"/>
           <w:szCs w:val="17"/>
           <w:lang w:val="en-US" w:eastAsia="zh-CN"/>
         </w:rPr>
-      </w:pPr>
-      <w:r>
-        <w:rPr>
-          <w:rFonts w:hint="eastAsia" w:ascii="MiSans Heavy" w:hAnsi="MiSans Heavy" w:eastAsia="MiSans Heavy" w:cs="MiSans Heavy"/>
-          <w:b/>
-          <w:bCs/>
-          <w:sz w:val="17"/>
-          <w:szCs w:val="17"/>
-          <w:lang w:val="en-US" w:eastAsia="zh-CN"/>
-        </w:rPr>
-        <w:t>• 背景与洞察：</w:t>
-      </w:r>
-      <w:r>
-        <w:rPr>
-          <w:rFonts w:hint="eastAsia" w:ascii="MiSans Light" w:hAnsi="MiSans Light" w:eastAsia="MiSans Light" w:cs="MiSans Light"/>
-          <w:sz w:val="17"/>
-          <w:szCs w:val="17"/>
-          <w:lang w:val="en-US" w:eastAsia="zh-CN"/>
-        </w:rPr>
-        <w:t>识别黄金批发业务中两类高频问题：新人销售依赖师带徒，产品知识和异议处理话术掌握周期长；私域咨询存在响应不及时、高频问题重复占用人工的问题。据此将项目定位为“RAG 智能客服 + 销售培训对练系统”，优先覆盖私域咨询承接与新人培训两类场景，数字人作为后续培训沉浸感和品牌展示的增强能力。</w:t>
+        <w:t>• 轻量 Agentic RAG 链路设计与知识工程：</w:t>
+      </w:r>
+      <w:r>
+        <w:rPr>
+          <w:rFonts w:hint="eastAsia" w:ascii="MiSans Light" w:hAnsi="MiSans Light" w:eastAsia="MiSans Light" w:cs="MiSans Light"/>
+          <w:sz w:val="17"/>
+          <w:szCs w:val="17"/>
+          <w:lang w:val="en-US" w:eastAsia="zh-CN"/>
+        </w:rPr>
+        <w:t xml:space="preserve"> 主导黄金产品知识库结构化设计，将知识拆分为产品知识、销售话术、异议处理三层；设计“意图识别 - 知识路由 - 检索增强 - 答案生成 - 合规校验 - 转人工判断”的轻量 Agentic RAG 链路，覆盖需求识别、产品推荐、异议处理与转人工场景；通过五段式对话状态机约束模型在不同业务阶段的回复目标、追问策略和边界，并通过 Prompt Engineering 约束品牌话术、价格边界和合规表达，降低幻觉和错误承诺风险。</w:t>
       </w:r>
     </w:p>
     <w:p>
@@ -2324,7 +2310,7 @@
         <w:jc w:val="both"/>
         <w:textAlignment w:val="auto"/>
         <w:rPr>
-          <w:rFonts w:hint="eastAsia" w:ascii="MiSans" w:hAnsi="MiSans" w:eastAsia="MiSans" w:cs="MiSans"/>
+          <w:rFonts w:hint="eastAsia" w:ascii="MiSans Light" w:hAnsi="MiSans Light" w:eastAsia="MiSans Light" w:cs="MiSans Light"/>
           <w:sz w:val="17"/>
           <w:szCs w:val="17"/>
           <w:lang w:val="en-US" w:eastAsia="zh-CN"/>
@@ -2339,16 +2325,16 @@
           <w:szCs w:val="17"/>
           <w:lang w:val="en-US" w:eastAsia="zh-CN"/>
         </w:rPr>
-        <w:t>• AI 能力设计与知识工程：</w:t>
-      </w:r>
-      <w:r>
-        <w:rPr>
-          <w:rFonts w:hint="eastAsia" w:ascii="MiSans Light" w:hAnsi="MiSans Light" w:eastAsia="MiSans Light" w:cs="MiSans Light"/>
-          <w:sz w:val="17"/>
-          <w:szCs w:val="17"/>
-          <w:lang w:val="en-US" w:eastAsia="zh-CN"/>
-        </w:rPr>
-        <w:t>主导黄金产品知识库结构化设计，将知识拆分为产品知识、销售话术、异议处理三层；设计基于 RAG 的问答链路和五段式对话状态机，覆盖需求识别、产品推荐、异议处理与转人工判断；通过 Prompt Engineering 约束品牌话术、价格边界和合规表达，降低大模型幻觉和错误承诺风险。</w:t>
+        <w:t>• 技术选型与效果评估：</w:t>
+      </w:r>
+      <w:r>
+        <w:rPr>
+          <w:rFonts w:hint="eastAsia" w:ascii="MiSans Light" w:hAnsi="MiSans Light" w:eastAsia="MiSans Light" w:cs="MiSans Light"/>
+          <w:sz w:val="17"/>
+          <w:szCs w:val="17"/>
+          <w:lang w:val="en-US" w:eastAsia="zh-CN"/>
+        </w:rPr>
+        <w:t>围绕知识库问答准确率、召回质量、系统接入成本、私域客服集成效率和后续数字人扩展能力，对比多种 AI 客服 / 数字人方案，明确以 RAG 智能问答为 MVP 核心、数字人为后续增强层的技术路径；设计 120 题分场景评估集，覆盖产品知识准确性、话术合规性、异议处理质量、转人工判断合理性等维度，结合人工抽检、badcase 归因和转人工记录持续优化知识库结构、Prompt 策略与路由规则。</w:t>
       </w:r>
     </w:p>
     <w:p>
@@ -2389,16 +2375,16 @@
           <w:szCs w:val="17"/>
           <w:lang w:val="en-US" w:eastAsia="zh-CN"/>
         </w:rPr>
-        <w:t>• 技术选型与效果评估：</w:t>
-      </w:r>
-      <w:r>
-        <w:rPr>
-          <w:rFonts w:hint="eastAsia" w:ascii="MiSans Light" w:hAnsi="MiSans Light" w:eastAsia="MiSans Light" w:cs="MiSans Light"/>
-          <w:sz w:val="17"/>
-          <w:szCs w:val="17"/>
-          <w:lang w:val="en-US" w:eastAsia="zh-CN"/>
-        </w:rPr>
-        <w:t>围绕知识库问答准确率、系统接入成本、私域客服集成效率和后续数字人扩展能力，对比多种 AI 客服 / 数字人方案，最终选择以 RAG 智能问答为 MVP 核心、数字人为后续增强层的技术路径；设计 120 题分场景评估集，覆盖产品知识准确性、话术合规性、异议处理质量三类维度。</w:t>
+        <w:t>• Badcase 归因与闭环迭代：</w:t>
+      </w:r>
+      <w:r>
+        <w:rPr>
+          <w:rFonts w:hint="eastAsia" w:ascii="MiSans Light" w:hAnsi="MiSans Light" w:eastAsia="MiSans Light" w:cs="MiSans Light"/>
+          <w:sz w:val="17"/>
+          <w:szCs w:val="17"/>
+          <w:lang w:val="en-US" w:eastAsia="zh-CN"/>
+        </w:rPr>
+        <w:t>建立客服问答 badcase 归因机制，将问题拆分为知识缺失、检索失准、意图识别错误、话术不合规、转人工判断不及时等类型；根据归因结果迭代知识库分层、检索规则、Prompt 模板和状态机节点，推动系统从“能回答”迭代到“答得准、可追问、可推荐、可转接”。</w:t>
       </w:r>
     </w:p>
     <w:p>
@@ -2439,56 +2425,6 @@
           <w:szCs w:val="17"/>
           <w:lang w:val="en-US" w:eastAsia="zh-CN"/>
         </w:rPr>
-        <w:t>• 评估与迭代：</w:t>
-      </w:r>
-      <w:r>
-        <w:rPr>
-          <w:rFonts w:hint="eastAsia" w:ascii="MiSans Light" w:hAnsi="MiSans Light" w:eastAsia="MiSans Light" w:cs="MiSans Light"/>
-          <w:sz w:val="17"/>
-          <w:szCs w:val="17"/>
-          <w:lang w:val="en-US" w:eastAsia="zh-CN"/>
-        </w:rPr>
-        <w:t>设计 120 题分场景评估集，覆盖产品知识准确性、话术合规性、异议处理质量三类维度；结合人工抽检、badcase 归因和转人工记录，持续优化知识库结构、Prompt 策略与转人工规则，推动系统从“能回答”迭代到“答得准、可转接、可追踪”。</w:t>
-      </w:r>
-    </w:p>
-    <w:p>
-      <w:pPr>
-        <w:keepNext w:val="0"/>
-        <w:keepLines w:val="0"/>
-        <w:pageBreakBefore w:val="0"/>
-        <w:widowControl w:val="0"/>
-        <w:tabs>
-          <w:tab w:val="left" w:pos="9113"/>
-        </w:tabs>
-        <w:kinsoku/>
-        <w:wordWrap/>
-        <w:overflowPunct/>
-        <w:topLinePunct w:val="0"/>
-        <w:autoSpaceDE w:val="0"/>
-        <w:autoSpaceDN w:val="0"/>
-        <w:bidi w:val="0"/>
-        <w:adjustRightInd/>
-        <w:snapToGrid/>
-        <w:spacing w:before="0" w:beforeLines="20" w:after="0" w:afterLines="20" w:line="280" w:lineRule="exact"/>
-        <w:ind w:left="130"/>
-        <w:jc w:val="both"/>
-        <w:textAlignment w:val="auto"/>
-        <w:rPr>
-          <w:rFonts w:hint="eastAsia" w:ascii="MiSans Light" w:hAnsi="MiSans Light" w:eastAsia="MiSans Light" w:cs="MiSans Light"/>
-          <w:sz w:val="17"/>
-          <w:szCs w:val="17"/>
-          <w:lang w:val="en-US" w:eastAsia="zh-CN"/>
-        </w:rPr>
-      </w:pPr>
-      <w:r>
-        <w:rPr>
-          <w:rFonts w:hint="eastAsia" w:ascii="MiSans Heavy" w:hAnsi="MiSans Heavy" w:eastAsia="MiSans Heavy" w:cs="MiSans Heavy"/>
-          <w:b/>
-          <w:bCs/>
-          <w:sz w:val="17"/>
-          <w:szCs w:val="17"/>
-          <w:lang w:val="en-US" w:eastAsia="zh-CN"/>
-        </w:rPr>
         <w:t>• 项目成果：</w:t>
       </w:r>
       <w:r>
@@ -2498,7 +2434,7 @@
           <w:szCs w:val="17"/>
           <w:lang w:val="en-US" w:eastAsia="zh-CN"/>
         </w:rPr>
-        <w:t>5个月完成MVP交付，覆盖内部500+销售人员；新人培训周期缩短约60%（约1个月→约2周）；私域响应效率提升2倍；专业讲解准确率达95%（120 题分场景人工评估集）；展厅客户转化率提升约15%（4家批发展示展厅前后各3个月对比）。</w:t>
+        <w:t>5 个月完成 MVP 交付，覆盖内部 500+ 销售人员；新人培训周期缩短约 60%（约 1 个月 -&gt; 约 2 周）；私域响应效率提升 2 倍；专业问答准确率达 95%（120 题分场景评估集）；展厅客户转化率提升约 15%（4 家批发展示展厅前后各 3 个月对比）。</w:t>
       </w:r>
     </w:p>
     <w:p>

</xml_diff>

<commit_message>
Refresh site with latest resume
</commit_message>
<xml_diff>
--- a/resume-ai-product-manager.docx
+++ b/resume-ai-product-manager.docx
@@ -670,7 +670,7 @@
           <w:sz w:val="17"/>
           <w:szCs w:val="17"/>
         </w:rPr>
-        <w:t xml:space="preserve"> 具备从产品定义到技术落地的独立判断能力；主导 AI 内容生产工作流设计、RAG 三层检索架构、对话状态机与 Prompt Engineering 落地；自主完成 LLM/Embedding 选型评测与 RAG 召回策略优化，RAG 召回准确率达 92%，智能客服专业问答准确率达 95%。</w:t>
+        <w:t xml:space="preserve"> 具备从产品定义到技术落地的独立判断能力；主导 AI 内容生产工作流设计、RAG 三层检索架构、对话状态机与 Prompt / Context Engineering 落地；自主完成 LLM/Embedding 选型评测与 RAG 召回策略优化，RAG 召回准确率达 92%，智能客服专业问答准确率达 95%。</w:t>
       </w:r>
     </w:p>
     <w:p>
@@ -1341,7 +1341,29 @@
           <w:szCs w:val="16"/>
           <w:lang w:val="en-US" w:eastAsia="zh-CN"/>
         </w:rPr>
-        <w:t>● AI 全链路视觉工作流产品方案设计：</w:t>
+        <w:t xml:space="preserve">● </w:t>
+      </w:r>
+      <w:r>
+        <w:rPr>
+          <w:rFonts w:hint="eastAsia" w:ascii="MiSans Heavy" w:hAnsi="MiSans Heavy" w:eastAsia="MiSans Heavy" w:cs="MiSans Heavy"/>
+          <w:b w:val="0"/>
+          <w:bCs w:val="0"/>
+          <w:sz w:val="16"/>
+          <w:szCs w:val="16"/>
+          <w:lang w:val="en-US" w:eastAsia="zh-CN"/>
+        </w:rPr>
+        <w:t>AI 全链路视觉工作流与 HITL 审阅机制设计</w:t>
+      </w:r>
+      <w:r>
+        <w:rPr>
+          <w:rFonts w:hint="eastAsia" w:ascii="MiSans Heavy" w:hAnsi="MiSans Heavy" w:eastAsia="MiSans Heavy" w:cs="MiSans Heavy"/>
+          <w:b/>
+          <w:bCs/>
+          <w:sz w:val="16"/>
+          <w:szCs w:val="16"/>
+          <w:lang w:val="en-US" w:eastAsia="zh-CN"/>
+        </w:rPr>
+        <w:t>：</w:t>
       </w:r>
       <w:r>
         <w:rPr>
@@ -1359,7 +1381,7 @@
           <w:szCs w:val="15"/>
           <w:lang w:val="en-US" w:eastAsia="zh-CN"/>
         </w:rPr>
-        <w:t>负责全链路视觉生产工作流的产品方案设计，将剧本解析、提示词生成、图片生成、批注审阅等节点拆为可协作、可追踪的任务模块；定义结构化分镜表、节点 AI 对话、画布助手等核心交互，具体工程实现由技术团队完成。</w:t>
+        <w:t>负责全链路视觉生产工作流的产品方案设计，将剧本解析、Prompt 生成、图片生成、批注审阅等节点拆为可协作、可追踪的任务模块；基于 Human-in-the-Loop 思路设计甲方批注、AI 优化建议与一键应用机制，形成“生成 - 审阅 - 优化 - 再生成”的闭环。</w:t>
       </w:r>
     </w:p>
     <w:p>
@@ -1500,25 +1522,16 @@
           <w:szCs w:val="16"/>
           <w:lang w:val="en-US" w:eastAsia="zh-CN"/>
         </w:rPr>
-        <w:t>● RAG Prompt经验库架构：</w:t>
-      </w:r>
-      <w:r>
-        <w:rPr>
-          <w:rFonts w:hint="eastAsia" w:ascii="MiSans" w:hAnsi="MiSans" w:eastAsia="MiSans" w:cs="MiSans"/>
+        <w:t>● RAG Prompt 经验库与 Context Engineering：</w:t>
+      </w:r>
+      <w:r>
+        <w:rPr>
+          <w:rFonts w:hint="eastAsia" w:ascii="MiSans Light" w:hAnsi="MiSans Light" w:eastAsia="MiSans Light" w:cs="MiSans Light"/>
           <w:sz w:val="15"/>
           <w:szCs w:val="15"/>
           <w:lang w:val="en-US" w:eastAsia="zh-CN"/>
         </w:rPr>
-        <w:t xml:space="preserve"> </w:t>
-      </w:r>
-      <w:r>
-        <w:rPr>
-          <w:rFonts w:hint="eastAsia" w:ascii="MiSans Light" w:hAnsi="MiSans Light" w:eastAsia="MiSans Light" w:cs="MiSans Light"/>
-          <w:sz w:val="15"/>
-          <w:szCs w:val="15"/>
-          <w:lang w:val="en-US" w:eastAsia="zh-CN"/>
-        </w:rPr>
-        <w:t>负责 Prompt 经验库的入库规则、质量权重、排序机制、检索链路和测评集设计；以用户下载作为入库触发信号，以生图行为和短时间重复调用作为质量权重，结合去重、负反馈降权、长尾过滤等防噪机制；设计“标签过滤 - 向量召回 - 重排序”三层检索链路，并通过 Query 扩展解决口语化输入与书面 Prompt 的语义距离问题，RAG 召回准确率达 92%（200 题测评集，迭代后重跑）。</w:t>
+        <w:t>负责 Prompt 经验库的入库规则、质量权重、排序机制、检索链路和测评集设计；以用户下载作为入库触发信号，以生图行为和短时间重复调用作为质量权重，结合去重、负反馈降权、长尾过滤等防噪机制；设计“标签过滤 - 向量召回 - 重排序”的三层检索链路，并通过 Query 扩展解决口语化输入与书面 Prompt 的语义距离问题；围绕 Context Precision、Context Recall 等维度构建 200 题测评集，RAG 召回准确率达 92%。</w:t>
       </w:r>
     </w:p>
     <w:p>
@@ -1600,7 +1613,6 @@
           <w:lang w:val="en-US" w:eastAsia="zh-CN"/>
         </w:rPr>
       </w:pPr>
-      <w:bookmarkStart w:id="0" w:name="_GoBack"/>
       <w:r>
         <w:rPr>
           <w:rFonts w:hint="eastAsia" w:ascii="MiSans Heavy" w:hAnsi="MiSans Heavy" w:eastAsia="MiSans Heavy" w:cs="MiSans Heavy"/>
@@ -1619,17 +1631,7 @@
           <w:szCs w:val="15"/>
           <w:lang w:val="en-US" w:eastAsia="zh-CN"/>
         </w:rPr>
-        <w:t>负责“订阅 + 积分”的商业化方案设计，将积分消耗与模型调用成本挂钩，支持用户按质量档和速度档选择生成能力；参与 PMF 验证和早期</w:t>
-      </w:r>
-      <w:bookmarkEnd w:id="0"/>
-      <w:r>
-        <w:rPr>
-          <w:rFonts w:hint="eastAsia" w:ascii="MiSans Light" w:hAnsi="MiSans Light" w:eastAsia="MiSans Light" w:cs="MiSans Light"/>
-          <w:sz w:val="15"/>
-          <w:szCs w:val="15"/>
-          <w:lang w:val="en-US" w:eastAsia="zh-CN"/>
-        </w:rPr>
-        <w:t>付费转化方案讨论，平台完成 8 家付费影视工作室签约，目标毛利率 40% 以上。</w:t>
+        <w:t>负责“订阅 + 积分”的商业化方案设计，将积分消耗与模型调用成本挂钩，支持用户按质量档和速度档选择生成能力；参与 PMF 验证和早期付费转化方案讨论，平台完成 8 家付费影视工作室签约，目标毛利率 40% 以上。</w:t>
       </w:r>
     </w:p>
     <w:p>
@@ -2284,7 +2286,18 @@
           <w:szCs w:val="17"/>
           <w:lang w:val="en-US" w:eastAsia="zh-CN"/>
         </w:rPr>
-        <w:t xml:space="preserve"> 主导黄金产品知识库结构化设计，将知识拆分为产品知识、销售话术、异议处理三层；设计“意图识别 - 知识路由 - 检索增强 - 答案生成 - 合规校验 - 转人工判断”的轻量 Agentic RAG 链路，覆盖需求识别、产品推荐、异议处理与转人工场景；通过五段式对话状态机约束模型在不同业务阶段的回复目标、追问策略和边界，并通过 Prompt Engineering 约束品牌话术、价格边界和合规表达，降低幻觉和错误承诺风险。</w:t>
+        <w:t xml:space="preserve"> 主导黄金产品知识库结构化设计，将知识拆分为产品知识、销售话术、异议处理三层；设计“Router 意图路由 - Retriever 检索增强 - Grader 相关性判断 - Generator 答案生成 - Verifier 合规校验/转人工判断”的轻量 Agentic RAG 控制回路，覆盖需求识别、产品推荐、异议处理与转人工场景；通过五段式对话状态机约束模型在不同业务阶段的回复目标、追问策略和边界，并通过 Prompt Engineering 约束品牌话术、价格边界和合</w:t>
+      </w:r>
+      <w:bookmarkStart w:id="0" w:name="_GoBack"/>
+      <w:bookmarkEnd w:id="0"/>
+      <w:r>
+        <w:rPr>
+          <w:rFonts w:hint="eastAsia" w:ascii="MiSans Light" w:hAnsi="MiSans Light" w:eastAsia="MiSans Light" w:cs="MiSans Light"/>
+          <w:sz w:val="17"/>
+          <w:szCs w:val="17"/>
+          <w:lang w:val="en-US" w:eastAsia="zh-CN"/>
+        </w:rPr>
+        <w:t>规表达，降低幻觉和错误承诺风险。</w:t>
       </w:r>
     </w:p>
     <w:p>
@@ -2334,7 +2347,7 @@
           <w:szCs w:val="17"/>
           <w:lang w:val="en-US" w:eastAsia="zh-CN"/>
         </w:rPr>
-        <w:t>围绕知识库问答准确率、召回质量、系统接入成本、私域客服集成效率和后续数字人扩展能力，对比多种 AI 客服 / 数字人方案，明确以 RAG 智能问答为 MVP 核心、数字人为后续增强层的技术路径；设计 120 题分场景评估集，覆盖产品知识准确性、话术合规性、异议处理质量、转人工判断合理性等维度，结合人工抽检、badcase 归因和转人工记录持续优化知识库结构、Prompt 策略与路由规则。</w:t>
+        <w:t>围绕知识库问答准确率、召回质量、系统接入成本、私域客服集成效率和后续数字人扩展能力，对比多种 AI 客服 / 数字人方案，明确以 RAG 智能问答为 MVP 核心、数字人为后续增强层的技术路径；设计 120 题分场景评估集，覆盖产品知识准确性、话术合规性、异议处理质量、转人工判断合理性等维度，用于验证 MVP 是否达到上线门槛。</w:t>
       </w:r>
     </w:p>
     <w:p>
@@ -2375,16 +2388,16 @@
           <w:szCs w:val="17"/>
           <w:lang w:val="en-US" w:eastAsia="zh-CN"/>
         </w:rPr>
-        <w:t>• Badcase 归因与闭环迭代：</w:t>
-      </w:r>
-      <w:r>
-        <w:rPr>
-          <w:rFonts w:hint="eastAsia" w:ascii="MiSans Light" w:hAnsi="MiSans Light" w:eastAsia="MiSans Light" w:cs="MiSans Light"/>
-          <w:sz w:val="17"/>
-          <w:szCs w:val="17"/>
-          <w:lang w:val="en-US" w:eastAsia="zh-CN"/>
-        </w:rPr>
-        <w:t>建立客服问答 badcase 归因机制，将问题拆分为知识缺失、检索失准、意图识别错误、话术不合规、转人工判断不及时等类型；根据归因结果迭代知识库分层、检索规则、Prompt 模板和状态机节点，推动系统从“能回答”迭代到“答得准、可追问、可推荐、可转接”。</w:t>
+        <w:t>• AI Eval 与 Badcase 闭环：</w:t>
+      </w:r>
+      <w:r>
+        <w:rPr>
+          <w:rFonts w:hint="eastAsia" w:ascii="MiSans Light" w:hAnsi="MiSans Light" w:eastAsia="MiSans Light" w:cs="MiSans Light"/>
+          <w:sz w:val="17"/>
+          <w:szCs w:val="17"/>
+          <w:lang w:val="en-US" w:eastAsia="zh-CN"/>
+        </w:rPr>
+        <w:t>基于评估集、人工抽检与 LLM 辅助评分，将客服问答 badcase 归因为知识缺失、检索失准、意图识别错误、话术不合规、转人工判断不及时等类型；根据归因结果持续优化知识库结构、Prompt 策略、路由规则和状态机节点。</w:t>
       </w:r>
     </w:p>
     <w:p>
@@ -2578,16 +2591,16 @@
           <w:sz w:val="17"/>
           <w:szCs w:val="17"/>
         </w:rPr>
-        <w:t>• RAG 语料整理与质量评估：</w:t>
-      </w:r>
-      <w:r>
-        <w:rPr>
-          <w:rFonts w:hint="eastAsia" w:ascii="MiSans Light" w:hAnsi="MiSans Light" w:eastAsia="MiSans Light" w:cs="MiSans Light"/>
-          <w:sz w:val="17"/>
-          <w:szCs w:val="17"/>
-          <w:lang w:val="en-US" w:eastAsia="zh-CN"/>
-        </w:rPr>
-        <w:t>负责"子曰"教育大模型文档问答场景的 RAG 测试数据建设，独立整理 1000+ 条 PDF 教材与翻译文档语料；自主设计三级错误分级框架（按语义完整性影响程度划分），系统归因复杂排版（表格乱码、图文混排、跨栏截断）下的解析失败类型，输出带典型样本与频率分布的问题分类报告，辅助算法组定向修复后召回准确率有所提升。</w:t>
+        <w:t>• RAG 语料治理与评估集建设：</w:t>
+      </w:r>
+      <w:r>
+        <w:rPr>
+          <w:rFonts w:hint="eastAsia" w:ascii="MiSans Light" w:hAnsi="MiSans Light" w:eastAsia="MiSans Light" w:cs="MiSans Light"/>
+          <w:sz w:val="17"/>
+          <w:szCs w:val="17"/>
+          <w:lang w:val="en-US" w:eastAsia="zh-CN"/>
+        </w:rPr>
+        <w:t>负责“子曰”教育大模型文档问答场景的 RAG 测试数据建设，独立整理 1000+ 条 PDF 教材与翻译文档语料；设计三级错误分级框架，围绕语义完整性、版面解析、跨段落召回等问题构建错误 taxonomy，输出带典型样本与频率分布的问题分类报告，辅助算法组定位复杂排版下的检索与解析失败问题。</w:t>
       </w:r>
     </w:p>
     <w:p>

</xml_diff>